<commit_message>
lab03 in other-student layout
</commit_message>
<xml_diff>
--- a/Lab_03/report/Lab_03.docx
+++ b/Lab_03/report/Lab_03.docx
@@ -484,6 +484,45 @@
         <w:rPr>
           <w:b/>
         </w:rPr>
+        <w:t>Теоретичні відомості</w:t>
+      </w:r>
+    </w:p>
+    <w:p>
+      <w:pPr>
+        <w:ind w:firstLine="709"/>
+        <w:jc w:val="both"/>
+      </w:pPr>
+      <w:r>
+        <w:t>Функціональний стиль спирається на чисті функції та незмінні структури даних. Незмінність дає референтну прозорість, просту композицію, безпечне спільне читання і хешованість: незмінний об’єкт може бути ключем словника, елементом множини та аргументом lru_cache.</w:t>
+      </w:r>
+    </w:p>
+    <w:p>
+      <w:pPr>
+        <w:ind w:firstLine="709"/>
+        <w:jc w:val="both"/>
+      </w:pPr>
+      <w:r>
+        <w:t>У стандартній бібліотеці Python для цього є tuple замість list, frozenset замість set, @dataclass(frozen=True, slots=True) для доменних сутностей (поля не можна присвоїти, усі оновлення виконуються через dataclasses.replace, який повертає нову копію) і MappingProxyType — представлення словника лише для читання.</w:t>
+      </w:r>
+    </w:p>
+    <w:p>
+      <w:pPr>
+        <w:ind w:firstLine="709"/>
+        <w:jc w:val="both"/>
+      </w:pPr>
+      <w:r>
+        <w:t>MappingProxyType захищає лише верхній рівень і показує зміни вихідного словника, тому перед обгортанням джерело копіюють; для вкладених структур потрібне глибоке заморожування. Ціна незмінності — створення нового об’єкта на кожне оновлення, але це компенсується відсутністю захисних копій і можливістю кешувати чисті розрахунки.</w:t>
+      </w:r>
+    </w:p>
+    <w:p>
+      <w:pPr>
+        <w:keepNext/>
+        <w:spacing w:after="80"/>
+      </w:pPr>
+      <w:r>
+        <w:rPr>
+          <w:b/>
+        </w:rPr>
         <w:t>Хід роботи</w:t>
       </w:r>
     </w:p>
@@ -544,7 +583,7 @@
         <w:t xml:space="preserve">4. Тести та вимірювання. </w:t>
       </w:r>
       <w:r>
-        <w:t>24 pytest-тести перевіряють немутацію, read-only поведінку, FrozenInstanceError, коректність нових копій, хешованість і кеш. Час порівняно через --durations=5 та pytest-benchmark: стара мутабельна модель (mutable_model.py) проти нової.</w:t>
+        <w:t>29 pytest-тестів (з них 5 property-based на Hypothesis) перевіряють немутацію, read-only поведінку, FrozenInstanceError, коректність нових копій, хешованість і кеш. Час порівняно через --durations=5 та вимірювання perf_counter у tests/test_performance.py: стара мутабельна модель (mutable_model.py) проти нової.</w:t>
       </w:r>
     </w:p>
     <w:p>
@@ -566,7 +605,7 @@
       <w:r>
         <w:drawing>
           <wp:inline xmlns:a="http://schemas.openxmlformats.org/drawingml/2006/main" xmlns:pic="http://schemas.openxmlformats.org/drawingml/2006/picture">
-            <wp:extent cx="5760000" cy="6255484"/>
+            <wp:extent cx="5760000" cy="6487742"/>
             <wp:docPr id="1" name="Picture 1"/>
             <wp:cNvGraphicFramePr>
               <a:graphicFrameLocks noChangeAspect="1"/>
@@ -587,7 +626,7 @@
                   <pic:spPr>
                     <a:xfrm>
                       <a:off x="0" y="0"/>
-                      <a:ext cx="5760000" cy="6255484"/>
+                      <a:ext cx="5760000" cy="6487742"/>
                     </a:xfrm>
                     <a:prstGeom prst="rect"/>
                   </pic:spPr>
@@ -782,7 +821,7 @@
       <w:r>
         <w:drawing>
           <wp:inline xmlns:a="http://schemas.openxmlformats.org/drawingml/2006/main" xmlns:pic="http://schemas.openxmlformats.org/drawingml/2006/picture">
-            <wp:extent cx="5760000" cy="8206364"/>
+            <wp:extent cx="5760000" cy="8451818"/>
             <wp:docPr id="5" name="Picture 5"/>
             <wp:cNvGraphicFramePr>
               <a:graphicFrameLocks noChangeAspect="1"/>
@@ -803,7 +842,7 @@
                   <pic:spPr>
                     <a:xfrm>
                       <a:off x="0" y="0"/>
-                      <a:ext cx="5760000" cy="8206364"/>
+                      <a:ext cx="5760000" cy="8451818"/>
                     </a:xfrm>
                     <a:prstGeom prst="rect"/>
                   </pic:spPr>
@@ -890,7 +929,7 @@
       <w:r>
         <w:drawing>
           <wp:inline xmlns:a="http://schemas.openxmlformats.org/drawingml/2006/main" xmlns:pic="http://schemas.openxmlformats.org/drawingml/2006/picture">
-            <wp:extent cx="5446849" cy="8460000"/>
+            <wp:extent cx="5497472" cy="8459999"/>
             <wp:docPr id="7" name="Picture 7"/>
             <wp:cNvGraphicFramePr>
               <a:graphicFrameLocks noChangeAspect="1"/>
@@ -899,7 +938,7 @@
               <a:graphicData uri="http://schemas.openxmlformats.org/drawingml/2006/picture">
                 <pic:pic>
                   <pic:nvPicPr>
-                    <pic:cNvPr id="0" name="tests_test_performance.py.png"/>
+                    <pic:cNvPr id="0" name="tests_test_properties.py_p.png"/>
                     <pic:cNvPicPr/>
                   </pic:nvPicPr>
                   <pic:blipFill>
@@ -911,7 +950,7 @@
                   <pic:spPr>
                     <a:xfrm>
                       <a:off x="0" y="0"/>
-                      <a:ext cx="5446849" cy="8460000"/>
+                      <a:ext cx="5497472" cy="8459999"/>
                     </a:xfrm>
                     <a:prstGeom prst="rect"/>
                   </pic:spPr>
@@ -934,7 +973,61 @@
           <w:i/>
           <w:sz w:val="24"/>
         </w:rPr>
-        <w:t>Рис. 7 – Benchmark до і після переходу на незмінні структури</w:t>
+        <w:t>Рис. 7 – Property-тести Hypothesis: чистота оновлень і hash, узгоджений з ==</w:t>
+      </w:r>
+    </w:p>
+    <w:p>
+      <w:pPr>
+        <w:jc w:val="center"/>
+      </w:pPr>
+      <w:r>
+        <w:drawing>
+          <wp:inline xmlns:a="http://schemas.openxmlformats.org/drawingml/2006/main" xmlns:pic="http://schemas.openxmlformats.org/drawingml/2006/picture">
+            <wp:extent cx="3660483" cy="8459999"/>
+            <wp:docPr id="8" name="Picture 8"/>
+            <wp:cNvGraphicFramePr>
+              <a:graphicFrameLocks noChangeAspect="1"/>
+            </wp:cNvGraphicFramePr>
+            <a:graphic>
+              <a:graphicData uri="http://schemas.openxmlformats.org/drawingml/2006/picture">
+                <pic:pic>
+                  <pic:nvPicPr>
+                    <pic:cNvPr id="0" name="tests_test_performance.py.png"/>
+                    <pic:cNvPicPr/>
+                  </pic:nvPicPr>
+                  <pic:blipFill>
+                    <a:blip r:embed="rId16"/>
+                    <a:stretch>
+                      <a:fillRect/>
+                    </a:stretch>
+                  </pic:blipFill>
+                  <pic:spPr>
+                    <a:xfrm>
+                      <a:off x="0" y="0"/>
+                      <a:ext cx="3660483" cy="8459999"/>
+                    </a:xfrm>
+                    <a:prstGeom prst="rect"/>
+                  </pic:spPr>
+                </pic:pic>
+              </a:graphicData>
+            </a:graphic>
+          </wp:inline>
+        </w:drawing>
+      </w:r>
+    </w:p>
+    <w:p>
+      <w:pPr>
+        <w:keepNext w:val="0"/>
+        <w:spacing w:after="120"/>
+        <w:jc w:val="center"/>
+      </w:pPr>
+      <w:r>
+        <w:rPr>
+          <w:b w:val="0"/>
+          <w:i/>
+          <w:sz w:val="24"/>
+        </w:rPr>
+        <w:t>Рис. 8 – Тести часу до і після переходу на незмінні структури</w:t>
       </w:r>
     </w:p>
     <w:p>
@@ -945,7 +1038,7 @@
         <w:drawing>
           <wp:inline xmlns:a="http://schemas.openxmlformats.org/drawingml/2006/main" xmlns:pic="http://schemas.openxmlformats.org/drawingml/2006/picture">
             <wp:extent cx="5760000" cy="6615446"/>
-            <wp:docPr id="8" name="Picture 8"/>
+            <wp:docPr id="9" name="Picture 9"/>
             <wp:cNvGraphicFramePr>
               <a:graphicFrameLocks noChangeAspect="1"/>
             </wp:cNvGraphicFramePr>
@@ -957,7 +1050,7 @@
                     <pic:cNvPicPr/>
                   </pic:nvPicPr>
                   <pic:blipFill>
-                    <a:blip r:embed="rId16"/>
+                    <a:blip r:embed="rId17"/>
                     <a:stretch>
                       <a:fillRect/>
                     </a:stretch>
@@ -988,7 +1081,7 @@
           <w:i/>
           <w:sz w:val="24"/>
         </w:rPr>
-        <w:t>Рис. 8 – Робота програми app.py</w:t>
+        <w:t>Рис. 9 – Робота програми app.py</w:t>
       </w:r>
     </w:p>
     <w:p>
@@ -998,8 +1091,8 @@
       <w:r>
         <w:drawing>
           <wp:inline xmlns:a="http://schemas.openxmlformats.org/drawingml/2006/main" xmlns:pic="http://schemas.openxmlformats.org/drawingml/2006/picture">
-            <wp:extent cx="5760000" cy="4424798"/>
-            <wp:docPr id="9" name="Picture 9"/>
+            <wp:extent cx="5760000" cy="5239892"/>
+            <wp:docPr id="10" name="Picture 10"/>
             <wp:cNvGraphicFramePr>
               <a:graphicFrameLocks noChangeAspect="1"/>
             </wp:cNvGraphicFramePr>
@@ -1011,7 +1104,7 @@
                     <pic:cNvPicPr/>
                   </pic:nvPicPr>
                   <pic:blipFill>
-                    <a:blip r:embed="rId17"/>
+                    <a:blip r:embed="rId18"/>
                     <a:stretch>
                       <a:fillRect/>
                     </a:stretch>
@@ -1019,7 +1112,7 @@
                   <pic:spPr>
                     <a:xfrm>
                       <a:off x="0" y="0"/>
-                      <a:ext cx="5760000" cy="4424798"/>
+                      <a:ext cx="5760000" cy="5239892"/>
                     </a:xfrm>
                     <a:prstGeom prst="rect"/>
                   </pic:spPr>
@@ -1042,7 +1135,7 @@
           <w:i/>
           <w:sz w:val="24"/>
         </w:rPr>
-        <w:t>Рис. 9 – Результати pytest</w:t>
+        <w:t>Рис. 10 – Результати pytest</w:t>
       </w:r>
     </w:p>
     <w:p>
@@ -1052,8 +1145,8 @@
       <w:r>
         <w:drawing>
           <wp:inline xmlns:a="http://schemas.openxmlformats.org/drawingml/2006/main" xmlns:pic="http://schemas.openxmlformats.org/drawingml/2006/picture">
-            <wp:extent cx="5760000" cy="1650627"/>
-            <wp:docPr id="10" name="Picture 10"/>
+            <wp:extent cx="5760000" cy="1490458"/>
+            <wp:docPr id="11" name="Picture 11"/>
             <wp:cNvGraphicFramePr>
               <a:graphicFrameLocks noChangeAspect="1"/>
             </wp:cNvGraphicFramePr>
@@ -1065,7 +1158,7 @@
                     <pic:cNvPicPr/>
                   </pic:nvPicPr>
                   <pic:blipFill>
-                    <a:blip r:embed="rId18"/>
+                    <a:blip r:embed="rId19"/>
                     <a:stretch>
                       <a:fillRect/>
                     </a:stretch>
@@ -1073,7 +1166,7 @@
                   <pic:spPr>
                     <a:xfrm>
                       <a:off x="0" y="0"/>
-                      <a:ext cx="5760000" cy="1650627"/>
+                      <a:ext cx="5760000" cy="1490458"/>
                     </a:xfrm>
                     <a:prstGeom prst="rect"/>
                   </pic:spPr>
@@ -1096,7 +1189,7 @@
           <w:i/>
           <w:sz w:val="24"/>
         </w:rPr>
-        <w:t>Рис. 10 – Час тестів pytest --durations=5</w:t>
+        <w:t>Рис. 11 – Час тестів pytest --durations=5</w:t>
       </w:r>
     </w:p>
     <w:p>
@@ -1106,8 +1199,8 @@
       <w:r>
         <w:drawing>
           <wp:inline xmlns:a="http://schemas.openxmlformats.org/drawingml/2006/main" xmlns:pic="http://schemas.openxmlformats.org/drawingml/2006/picture">
-            <wp:extent cx="5760000" cy="1639708"/>
-            <wp:docPr id="11" name="Picture 11"/>
+            <wp:extent cx="5760000" cy="2044800"/>
+            <wp:docPr id="12" name="Picture 12"/>
             <wp:cNvGraphicFramePr>
               <a:graphicFrameLocks noChangeAspect="1"/>
             </wp:cNvGraphicFramePr>
@@ -1119,7 +1212,7 @@
                     <pic:cNvPicPr/>
                   </pic:nvPicPr>
                   <pic:blipFill>
-                    <a:blip r:embed="rId19"/>
+                    <a:blip r:embed="rId20"/>
                     <a:stretch>
                       <a:fillRect/>
                     </a:stretch>
@@ -1127,7 +1220,7 @@
                   <pic:spPr>
                     <a:xfrm>
                       <a:off x="0" y="0"/>
-                      <a:ext cx="5760000" cy="1639708"/>
+                      <a:ext cx="5760000" cy="2044800"/>
                     </a:xfrm>
                     <a:prstGeom prst="rect"/>
                   </pic:spPr>
@@ -1150,7 +1243,7 @@
           <w:i/>
           <w:sz w:val="24"/>
         </w:rPr>
-        <w:t>Рис. 11 – Порівняння часу через pytest-benchmark</w:t>
+        <w:t>Рис. 12 – Порівняння часу до і після (perf_counter)</w:t>
       </w:r>
     </w:p>
     <w:p>
@@ -1161,7 +1254,7 @@
         <w:drawing>
           <wp:inline xmlns:a="http://schemas.openxmlformats.org/drawingml/2006/main" xmlns:pic="http://schemas.openxmlformats.org/drawingml/2006/picture">
             <wp:extent cx="5760000" cy="906822"/>
-            <wp:docPr id="12" name="Picture 12"/>
+            <wp:docPr id="13" name="Picture 13"/>
             <wp:cNvGraphicFramePr>
               <a:graphicFrameLocks noChangeAspect="1"/>
             </wp:cNvGraphicFramePr>
@@ -1173,7 +1266,7 @@
                     <pic:cNvPicPr/>
                   </pic:nvPicPr>
                   <pic:blipFill>
-                    <a:blip r:embed="rId20"/>
+                    <a:blip r:embed="rId21"/>
                     <a:stretch>
                       <a:fillRect/>
                     </a:stretch>
@@ -1204,7 +1297,7 @@
           <w:i/>
           <w:sz w:val="24"/>
         </w:rPr>
-        <w:t>Рис. 12 – Перевірка mypy, black і ruff</w:t>
+        <w:t>Рис. 13 – Перевірка mypy, black і ruff</w:t>
       </w:r>
     </w:p>
     <w:p>

</xml_diff>